<commit_message>
Seprate party invoice for uk
</commit_message>
<xml_diff>
--- a/electron/database/generate-document/templates/party-invoice.docx
+++ b/electron/database/generate-document/templates/party-invoice.docx
@@ -219,12 +219,14 @@
               </w:rPr>
               <w:t>{</w:t>
             </w:r>
+            <w:proofErr w:type="spellStart"/>
             <w:r>
               <w:rPr>
                 <w:rFonts w:cstheme="minorHAnsi"/>
               </w:rPr>
               <w:t>invoiceNo</w:t>
             </w:r>
+            <w:proofErr w:type="spellEnd"/>
             <w:r>
               <w:rPr>
                 <w:rFonts w:cstheme="minorHAnsi"/>
@@ -266,12 +268,14 @@
               </w:rPr>
               <w:t>{</w:t>
             </w:r>
+            <w:proofErr w:type="spellStart"/>
             <w:r>
               <w:rPr>
                 <w:rFonts w:cstheme="minorHAnsi"/>
               </w:rPr>
               <w:t>invoiceDate</w:t>
             </w:r>
+            <w:proofErr w:type="spellEnd"/>
             <w:r>
               <w:rPr>
                 <w:rFonts w:cstheme="minorHAnsi"/>
@@ -334,12 +338,14 @@
               </w:rPr>
               <w:t>{</w:t>
             </w:r>
+            <w:proofErr w:type="spellStart"/>
             <w:r>
               <w:rPr>
                 <w:rFonts w:cstheme="minorHAnsi"/>
               </w:rPr>
               <w:t>buyersOrderNo</w:t>
             </w:r>
+            <w:proofErr w:type="spellEnd"/>
             <w:r>
               <w:rPr>
                 <w:rFonts w:cstheme="minorHAnsi"/>
@@ -382,12 +388,14 @@
               </w:rPr>
               <w:t>{</w:t>
             </w:r>
+            <w:proofErr w:type="spellStart"/>
             <w:r>
               <w:rPr>
                 <w:rFonts w:cstheme="minorHAnsi"/>
               </w:rPr>
               <w:t>orderDate</w:t>
             </w:r>
+            <w:proofErr w:type="spellEnd"/>
             <w:r>
               <w:rPr>
                 <w:rFonts w:cstheme="minorHAnsi"/>
@@ -452,6 +460,7 @@
               </w:rPr>
               <w:t>{</w:t>
             </w:r>
+            <w:proofErr w:type="spellStart"/>
             <w:r>
               <w:rPr>
                 <w:rFonts w:cstheme="minorHAnsi"/>
@@ -460,6 +469,7 @@
               </w:rPr>
               <w:t>consigneeName</w:t>
             </w:r>
+            <w:proofErr w:type="spellEnd"/>
             <w:r>
               <w:rPr>
                 <w:rFonts w:cstheme="minorHAnsi"/>
@@ -485,6 +495,7 @@
               </w:rPr>
               <w:t>{</w:t>
             </w:r>
+            <w:proofErr w:type="spellStart"/>
             <w:r>
               <w:rPr>
                 <w:rFonts w:cstheme="minorHAnsi"/>
@@ -493,6 +504,7 @@
               </w:rPr>
               <w:t>consigneeAddress</w:t>
             </w:r>
+            <w:proofErr w:type="spellEnd"/>
             <w:r>
               <w:rPr>
                 <w:rFonts w:cstheme="minorHAnsi"/>
@@ -501,6 +513,7 @@
               </w:rPr>
               <w:t>} {</w:t>
             </w:r>
+            <w:proofErr w:type="spellStart"/>
             <w:r>
               <w:rPr>
                 <w:rFonts w:cstheme="minorHAnsi"/>
@@ -509,6 +522,7 @@
               </w:rPr>
               <w:t>consigneeCity</w:t>
             </w:r>
+            <w:proofErr w:type="spellEnd"/>
             <w:r>
               <w:rPr>
                 <w:rFonts w:cstheme="minorHAnsi"/>
@@ -517,6 +531,7 @@
               </w:rPr>
               <w:t>} {</w:t>
             </w:r>
+            <w:proofErr w:type="spellStart"/>
             <w:r>
               <w:rPr>
                 <w:rFonts w:cstheme="minorHAnsi"/>
@@ -525,6 +540,7 @@
               </w:rPr>
               <w:t>consigneeState</w:t>
             </w:r>
+            <w:proofErr w:type="spellEnd"/>
             <w:r>
               <w:rPr>
                 <w:rFonts w:cstheme="minorHAnsi"/>
@@ -550,6 +566,7 @@
               </w:rPr>
               <w:t>{</w:t>
             </w:r>
+            <w:proofErr w:type="spellStart"/>
             <w:r>
               <w:rPr>
                 <w:rFonts w:cstheme="minorHAnsi"/>
@@ -558,6 +575,7 @@
               </w:rPr>
               <w:t>consigneeCountry</w:t>
             </w:r>
+            <w:proofErr w:type="spellEnd"/>
             <w:r>
               <w:rPr>
                 <w:rFonts w:cstheme="minorHAnsi"/>
@@ -566,6 +584,7 @@
               </w:rPr>
               <w:t>} {</w:t>
             </w:r>
+            <w:proofErr w:type="spellStart"/>
             <w:r>
               <w:rPr>
                 <w:rFonts w:cstheme="minorHAnsi"/>
@@ -574,6 +593,7 @@
               </w:rPr>
               <w:t>consigneeZip</w:t>
             </w:r>
+            <w:proofErr w:type="spellEnd"/>
             <w:r>
               <w:rPr>
                 <w:rFonts w:cstheme="minorHAnsi"/>
@@ -591,87 +611,6 @@
                 <w:szCs w:val="20"/>
               </w:rPr>
             </w:pPr>
-            <w:r>
-              <w:rPr>
-                <w:rFonts w:cstheme="minorHAnsi"/>
-                <w:sz w:val="20"/>
-                <w:szCs w:val="20"/>
-              </w:rPr>
-              <w:t>{#isUK}</w:t>
-            </w:r>
-            <w:r>
-              <w:rPr>
-                <w:rFonts w:cstheme="minorHAnsi"/>
-                <w:sz w:val="20"/>
-                <w:szCs w:val="20"/>
-              </w:rPr>
-              <w:t>TELE: {</w:t>
-            </w:r>
-            <w:r>
-              <w:rPr>
-                <w:rFonts w:cstheme="minorHAnsi"/>
-                <w:sz w:val="20"/>
-                <w:szCs w:val="20"/>
-              </w:rPr>
-              <w:t>consigneePhone</w:t>
-            </w:r>
-            <w:r>
-              <w:rPr>
-                <w:rFonts w:cstheme="minorHAnsi"/>
-                <w:sz w:val="20"/>
-                <w:szCs w:val="20"/>
-              </w:rPr>
-              <w:t xml:space="preserve">} </w:t>
-            </w:r>
-          </w:p>
-          <w:p>
-            <w:pPr>
-              <w:rPr>
-                <w:rFonts w:cstheme="minorHAnsi"/>
-                <w:sz w:val="20"/>
-                <w:szCs w:val="20"/>
-              </w:rPr>
-            </w:pPr>
-            <w:r>
-              <w:rPr>
-                <w:rFonts w:cstheme="minorHAnsi"/>
-                <w:sz w:val="20"/>
-                <w:szCs w:val="20"/>
-              </w:rPr>
-              <w:t>EMAIL</w:t>
-            </w:r>
-            <w:r>
-              <w:rPr>
-                <w:rFonts w:cstheme="minorHAnsi"/>
-                <w:sz w:val="20"/>
-                <w:szCs w:val="20"/>
-              </w:rPr>
-              <w:t>: {</w:t>
-            </w:r>
-            <w:r>
-              <w:rPr>
-                <w:rFonts w:cstheme="minorHAnsi"/>
-                <w:sz w:val="20"/>
-                <w:szCs w:val="20"/>
-              </w:rPr>
-              <w:t>consigneeEmail</w:t>
-            </w:r>
-            <w:r>
-              <w:rPr>
-                <w:rFonts w:cstheme="minorHAnsi"/>
-                <w:sz w:val="20"/>
-                <w:szCs w:val="20"/>
-              </w:rPr>
-              <w:t>}</w:t>
-            </w:r>
-            <w:r>
-              <w:rPr>
-                <w:rFonts w:cstheme="minorHAnsi"/>
-                <w:sz w:val="20"/>
-                <w:szCs w:val="20"/>
-              </w:rPr>
-              <w:t>{/isUK}</w:t>
-            </w:r>
           </w:p>
         </w:tc>
         <w:tc>
@@ -716,6 +655,7 @@
               </w:rPr>
               <w:t>{</w:t>
             </w:r>
+            <w:proofErr w:type="spellStart"/>
             <w:r>
               <w:rPr>
                 <w:rFonts w:cstheme="minorHAnsi"/>
@@ -724,6 +664,7 @@
               </w:rPr>
               <w:t>buyerName</w:t>
             </w:r>
+            <w:proofErr w:type="spellEnd"/>
             <w:r>
               <w:rPr>
                 <w:rFonts w:cstheme="minorHAnsi"/>
@@ -749,6 +690,7 @@
               </w:rPr>
               <w:t>{</w:t>
             </w:r>
+            <w:proofErr w:type="spellStart"/>
             <w:r>
               <w:rPr>
                 <w:rFonts w:cstheme="minorHAnsi"/>
@@ -757,6 +699,7 @@
               </w:rPr>
               <w:t>buyerAddress</w:t>
             </w:r>
+            <w:proofErr w:type="spellEnd"/>
             <w:r>
               <w:rPr>
                 <w:rFonts w:cstheme="minorHAnsi"/>
@@ -765,6 +708,7 @@
               </w:rPr>
               <w:t>} {</w:t>
             </w:r>
+            <w:proofErr w:type="spellStart"/>
             <w:r>
               <w:rPr>
                 <w:rFonts w:cstheme="minorHAnsi"/>
@@ -773,6 +717,7 @@
               </w:rPr>
               <w:t>buyerCity</w:t>
             </w:r>
+            <w:proofErr w:type="spellEnd"/>
             <w:r>
               <w:rPr>
                 <w:rFonts w:cstheme="minorHAnsi"/>
@@ -781,6 +726,7 @@
               </w:rPr>
               <w:t>} {</w:t>
             </w:r>
+            <w:proofErr w:type="spellStart"/>
             <w:r>
               <w:rPr>
                 <w:rFonts w:cstheme="minorHAnsi"/>
@@ -789,6 +735,7 @@
               </w:rPr>
               <w:t>buyerState</w:t>
             </w:r>
+            <w:proofErr w:type="spellEnd"/>
             <w:r>
               <w:rPr>
                 <w:rFonts w:cstheme="minorHAnsi"/>
@@ -814,6 +761,7 @@
               </w:rPr>
               <w:t>{</w:t>
             </w:r>
+            <w:proofErr w:type="spellStart"/>
             <w:r>
               <w:rPr>
                 <w:rFonts w:cstheme="minorHAnsi"/>
@@ -822,6 +770,7 @@
               </w:rPr>
               <w:t>buyerCountry</w:t>
             </w:r>
+            <w:proofErr w:type="spellEnd"/>
             <w:r>
               <w:rPr>
                 <w:rFonts w:cstheme="minorHAnsi"/>
@@ -830,6 +779,7 @@
               </w:rPr>
               <w:t>} {</w:t>
             </w:r>
+            <w:proofErr w:type="spellStart"/>
             <w:r>
               <w:rPr>
                 <w:rFonts w:cstheme="minorHAnsi"/>
@@ -838,6 +788,7 @@
               </w:rPr>
               <w:t>buyerZip</w:t>
             </w:r>
+            <w:proofErr w:type="spellEnd"/>
             <w:r>
               <w:rPr>
                 <w:rFonts w:cstheme="minorHAnsi"/>
@@ -909,6 +860,7 @@
               </w:rPr>
               <w:t>{</w:t>
             </w:r>
+            <w:proofErr w:type="spellStart"/>
             <w:r>
               <w:rPr>
                 <w:rFonts w:cstheme="minorHAnsi"/>
@@ -917,6 +869,7 @@
               </w:rPr>
               <w:t>originOfGoods</w:t>
             </w:r>
+            <w:proofErr w:type="spellEnd"/>
             <w:r>
               <w:rPr>
                 <w:rFonts w:cstheme="minorHAnsi"/>
@@ -968,6 +921,7 @@
               </w:rPr>
               <w:t>{</w:t>
             </w:r>
+            <w:proofErr w:type="spellStart"/>
             <w:r>
               <w:rPr>
                 <w:rFonts w:cstheme="minorHAnsi"/>
@@ -976,6 +930,7 @@
               </w:rPr>
               <w:t>finalDestination</w:t>
             </w:r>
+            <w:proofErr w:type="spellEnd"/>
             <w:r>
               <w:rPr>
                 <w:rFonts w:cstheme="minorHAnsi"/>
@@ -1052,6 +1007,7 @@
               </w:rPr>
               <w:t>{</w:t>
             </w:r>
+            <w:proofErr w:type="spellStart"/>
             <w:r>
               <w:rPr>
                 <w:rFonts w:cstheme="minorHAnsi"/>
@@ -1060,6 +1016,7 @@
               </w:rPr>
               <w:t>termOfDeliveryAndPayment</w:t>
             </w:r>
+            <w:proofErr w:type="spellEnd"/>
             <w:r>
               <w:rPr>
                 <w:rFonts w:cstheme="minorHAnsi"/>
@@ -1096,6 +1053,7 @@
                 <w:szCs w:val="20"/>
               </w:rPr>
             </w:pPr>
+            <w:proofErr w:type="spellStart"/>
             <w:r>
               <w:rPr>
                 <w:rFonts w:ascii="SansSerif" w:hAnsi="SansSerif" w:cs="SansSerif"/>
@@ -1103,7 +1061,17 @@
                 <w:sz w:val="20"/>
                 <w:szCs w:val="20"/>
               </w:rPr>
-              <w:t>Precarriage by:</w:t>
+              <w:t>Precarriage</w:t>
+            </w:r>
+            <w:proofErr w:type="spellEnd"/>
+            <w:r>
+              <w:rPr>
+                <w:rFonts w:ascii="SansSerif" w:hAnsi="SansSerif" w:cs="SansSerif"/>
+                <w:color w:val="000000"/>
+                <w:sz w:val="20"/>
+                <w:szCs w:val="20"/>
+              </w:rPr>
+              <w:t xml:space="preserve"> by:</w:t>
             </w:r>
           </w:p>
           <w:p>
@@ -1123,6 +1091,7 @@
               </w:rPr>
               <w:t>{</w:t>
             </w:r>
+            <w:proofErr w:type="spellStart"/>
             <w:r>
               <w:rPr>
                 <w:rFonts w:cstheme="minorHAnsi"/>
@@ -1131,6 +1100,7 @@
               </w:rPr>
               <w:t>precarriageBy</w:t>
             </w:r>
+            <w:proofErr w:type="spellEnd"/>
             <w:r>
               <w:rPr>
                 <w:rFonts w:cstheme="minorHAnsi"/>
@@ -1192,6 +1162,7 @@
               </w:rPr>
               <w:t>{</w:t>
             </w:r>
+            <w:proofErr w:type="spellStart"/>
             <w:r>
               <w:rPr>
                 <w:rFonts w:ascii="SansSerif" w:hAnsi="SansSerif" w:cs="SansSerif"/>
@@ -1201,6 +1172,7 @@
               </w:rPr>
               <w:t>placeOfReceipt</w:t>
             </w:r>
+            <w:proofErr w:type="spellEnd"/>
             <w:r>
               <w:rPr>
                 <w:rFonts w:ascii="SansSerif" w:hAnsi="SansSerif" w:cs="SansSerif"/>
@@ -1291,6 +1263,7 @@
               </w:rPr>
               <w:t>{</w:t>
             </w:r>
+            <w:proofErr w:type="spellStart"/>
             <w:r>
               <w:rPr>
                 <w:rFonts w:ascii="SansSerif" w:hAnsi="SansSerif" w:cs="SansSerif"/>
@@ -1300,6 +1273,7 @@
               </w:rPr>
               <w:t>vesselNo</w:t>
             </w:r>
+            <w:proofErr w:type="spellEnd"/>
             <w:r>
               <w:rPr>
                 <w:rFonts w:ascii="SansSerif" w:hAnsi="SansSerif" w:cs="SansSerif"/>
@@ -1362,6 +1336,7 @@
               </w:rPr>
               <w:t>{</w:t>
             </w:r>
+            <w:proofErr w:type="spellStart"/>
             <w:r>
               <w:rPr>
                 <w:rFonts w:ascii="SansSerif" w:hAnsi="SansSerif" w:cs="SansSerif"/>
@@ -1371,6 +1346,7 @@
               </w:rPr>
               <w:t>portOfLoading</w:t>
             </w:r>
+            <w:proofErr w:type="spellEnd"/>
             <w:r>
               <w:rPr>
                 <w:rFonts w:ascii="SansSerif" w:hAnsi="SansSerif" w:cs="SansSerif"/>
@@ -1456,6 +1432,7 @@
               </w:rPr>
               <w:t>{</w:t>
             </w:r>
+            <w:proofErr w:type="spellStart"/>
             <w:r>
               <w:rPr>
                 <w:rFonts w:ascii="SansSerif" w:hAnsi="SansSerif" w:cs="SansSerif"/>
@@ -1465,6 +1442,7 @@
               </w:rPr>
               <w:t>portOfDischarge</w:t>
             </w:r>
+            <w:proofErr w:type="spellEnd"/>
             <w:r>
               <w:rPr>
                 <w:rFonts w:ascii="SansSerif" w:hAnsi="SansSerif" w:cs="SansSerif"/>
@@ -1523,6 +1501,7 @@
               </w:rPr>
               <w:t>{</w:t>
             </w:r>
+            <w:proofErr w:type="spellStart"/>
             <w:r>
               <w:rPr>
                 <w:rFonts w:ascii="SansSerif" w:hAnsi="SansSerif" w:cs="SansSerif"/>
@@ -1532,6 +1511,7 @@
               </w:rPr>
               <w:t>finalDestination</w:t>
             </w:r>
+            <w:proofErr w:type="spellEnd"/>
             <w:r>
               <w:rPr>
                 <w:rFonts w:ascii="SansSerif" w:hAnsi="SansSerif" w:cs="SansSerif"/>
@@ -1602,6 +1582,7 @@
               </w:rPr>
               <w:t>{</w:t>
             </w:r>
+            <w:proofErr w:type="spellStart"/>
             <w:r>
               <w:rPr>
                 <w:rFonts w:cstheme="minorHAnsi"/>
@@ -1610,6 +1591,7 @@
               </w:rPr>
               <w:t>privateRemark</w:t>
             </w:r>
+            <w:proofErr w:type="spellEnd"/>
             <w:r>
               <w:rPr>
                 <w:rFonts w:cstheme="minorHAnsi"/>
@@ -1637,7 +1619,7 @@
           <w:tbl>
             <w:tblPr>
               <w:tblStyle w:val="TableGrid"/>
-              <w:tblW w:w="11055" w:type="dxa"/>
+              <w:tblW w:w="0" w:type="auto"/>
               <w:tblBorders>
                 <w:top w:val="none" w:sz="0" w:space="0" w:color="auto"/>
                 <w:left w:val="none" w:sz="0" w:space="0" w:color="auto"/>
@@ -1646,17 +1628,21 @@
                 <w:insideH w:val="none" w:sz="0" w:space="0" w:color="auto"/>
               </w:tblBorders>
               <w:tblLayout w:type="fixed"/>
+              <w:tblCellMar>
+                <w:left w:w="57" w:type="dxa"/>
+                <w:right w:w="113" w:type="dxa"/>
+              </w:tblCellMar>
               <w:tblLook w:val="04A0" w:firstRow="1" w:lastRow="0" w:firstColumn="1" w:lastColumn="0" w:noHBand="0" w:noVBand="1"/>
             </w:tblPr>
             <w:tblGrid>
+              <w:gridCol w:w="851"/>
+              <w:gridCol w:w="2126"/>
               <w:gridCol w:w="1985"/>
-              <w:gridCol w:w="2044"/>
-              <w:gridCol w:w="1870"/>
-              <w:gridCol w:w="1005"/>
-              <w:gridCol w:w="872"/>
-              <w:gridCol w:w="1005"/>
-              <w:gridCol w:w="1005"/>
-              <w:gridCol w:w="1269"/>
+              <w:gridCol w:w="1701"/>
+              <w:gridCol w:w="1614"/>
+              <w:gridCol w:w="911"/>
+              <w:gridCol w:w="855"/>
+              <w:gridCol w:w="994"/>
             </w:tblGrid>
             <w:tr>
               <w:trPr>
@@ -1664,7 +1650,7 @@
               </w:trPr>
               <w:tc>
                 <w:tcPr>
-                  <w:tcW w:w="1985" w:type="dxa"/>
+                  <w:tcW w:w="851" w:type="dxa"/>
                   <w:tcBorders>
                     <w:right w:val="nil"/>
                   </w:tcBorders>
@@ -1696,7 +1682,7 @@
               </w:tc>
               <w:tc>
                 <w:tcPr>
-                  <w:tcW w:w="2044" w:type="dxa"/>
+                  <w:tcW w:w="2126" w:type="dxa"/>
                   <w:tcBorders>
                     <w:left w:val="nil"/>
                     <w:right w:val="nil"/>
@@ -1723,13 +1709,99 @@
                       <w:sz w:val="20"/>
                       <w:szCs w:val="20"/>
                     </w:rPr>
-                    <w:t>{#isAus}ASW No{/isAus}{^isAus}Grade{/isAus}</w:t>
+                    <w:t>{#</w:t>
+                  </w:r>
+                  <w:proofErr w:type="gramStart"/>
+                  <w:r>
+                    <w:rPr>
+                      <w:rFonts w:cstheme="minorHAnsi"/>
+                      <w:b/>
+                      <w:bCs/>
+                      <w:sz w:val="20"/>
+                      <w:szCs w:val="20"/>
+                    </w:rPr>
+                    <w:t>isAus}ASW</w:t>
+                  </w:r>
+                  <w:proofErr w:type="gramEnd"/>
+                  <w:r>
+                    <w:rPr>
+                      <w:rFonts w:cstheme="minorHAnsi"/>
+                      <w:b/>
+                      <w:bCs/>
+                      <w:sz w:val="20"/>
+                      <w:szCs w:val="20"/>
+                    </w:rPr>
+                    <w:t xml:space="preserve"> No{/</w:t>
+                  </w:r>
+                  <w:proofErr w:type="spellStart"/>
+                  <w:r>
+                    <w:rPr>
+                      <w:rFonts w:cstheme="minorHAnsi"/>
+                      <w:b/>
+                      <w:bCs/>
+                      <w:sz w:val="20"/>
+                      <w:szCs w:val="20"/>
+                    </w:rPr>
+                    <w:t>isAus</w:t>
+                  </w:r>
+                  <w:proofErr w:type="spellEnd"/>
+                  <w:r>
+                    <w:rPr>
+                      <w:rFonts w:cstheme="minorHAnsi"/>
+                      <w:b/>
+                      <w:bCs/>
+                      <w:sz w:val="20"/>
+                      <w:szCs w:val="20"/>
+                    </w:rPr>
+                    <w:t>}</w:t>
+                  </w:r>
+                  <w:r>
+                    <w:rPr>
+                      <w:rFonts w:cstheme="minorHAnsi"/>
+                      <w:b/>
+                      <w:bCs/>
+                      <w:sz w:val="20"/>
+                      <w:szCs w:val="20"/>
+                    </w:rPr>
+                    <w:t xml:space="preserve"> {#</w:t>
+                  </w:r>
+                  <w:proofErr w:type="gramStart"/>
+                  <w:r>
+                    <w:rPr>
+                      <w:rFonts w:cstheme="minorHAnsi"/>
+                      <w:b/>
+                      <w:bCs/>
+                      <w:sz w:val="20"/>
+                      <w:szCs w:val="20"/>
+                    </w:rPr>
+                    <w:t>isGen}</w:t>
+                  </w:r>
+                  <w:r>
+                    <w:rPr>
+                      <w:rFonts w:cstheme="minorHAnsi"/>
+                      <w:b/>
+                      <w:spacing w:val="-4"/>
+                      <w:sz w:val="20"/>
+                      <w:szCs w:val="20"/>
+                    </w:rPr>
+                    <w:t>Grade</w:t>
+                  </w:r>
+                  <w:proofErr w:type="gramEnd"/>
+                  <w:r>
+                    <w:rPr>
+                      <w:rFonts w:cstheme="minorHAnsi"/>
+                      <w:b/>
+                      <w:bCs/>
+                      <w:sz w:val="20"/>
+                      <w:szCs w:val="20"/>
+                    </w:rPr>
+                    <w:t>{/isGen}</w:t>
                   </w:r>
                 </w:p>
               </w:tc>
               <w:tc>
                 <w:tcPr>
-                  <w:tcW w:w="1870" w:type="dxa"/>
+                  <w:tcW w:w="1985" w:type="dxa"/>
                   <w:tcBorders>
                     <w:left w:val="nil"/>
                     <w:right w:val="nil"/>
@@ -1756,8 +1828,9 @@
                       <w:sz w:val="20"/>
                       <w:szCs w:val="20"/>
                     </w:rPr>
-                    <w:t xml:space="preserve">{#isAus}ASW </w:t>
-                  </w:r>
+                    <w:t>{#</w:t>
+                  </w:r>
+                  <w:proofErr w:type="gramStart"/>
                   <w:r>
                     <w:rPr>
                       <w:rFonts w:cstheme="minorHAnsi"/>
@@ -1766,8 +1839,9 @@
                       <w:sz w:val="20"/>
                       <w:szCs w:val="20"/>
                     </w:rPr>
-                    <w:t>PO.</w:t>
-                  </w:r>
+                    <w:t>isAus}ASW</w:t>
+                  </w:r>
+                  <w:proofErr w:type="gramEnd"/>
                   <w:r>
                     <w:rPr>
                       <w:rFonts w:cstheme="minorHAnsi"/>
@@ -1776,8 +1850,10 @@
                       <w:sz w:val="20"/>
                       <w:szCs w:val="20"/>
                     </w:rPr>
-                    <w:t>No{/isAus}{^isAus}</w:t>
-                  </w:r>
+                    <w:t xml:space="preserve"> </w:t>
+                  </w:r>
+                  <w:proofErr w:type="spellStart"/>
+                  <w:proofErr w:type="gramStart"/>
                   <w:r>
                     <w:rPr>
                       <w:rFonts w:cstheme="minorHAnsi"/>
@@ -1786,8 +1862,10 @@
                       <w:sz w:val="20"/>
                       <w:szCs w:val="20"/>
                     </w:rPr>
-                    <w:t>Brand</w:t>
-                  </w:r>
+                    <w:t>PO.No</w:t>
+                  </w:r>
+                  <w:proofErr w:type="spellEnd"/>
+                  <w:proofErr w:type="gramEnd"/>
                   <w:r>
                     <w:rPr>
                       <w:rFonts w:cstheme="minorHAnsi"/>
@@ -1796,13 +1874,79 @@
                       <w:sz w:val="20"/>
                       <w:szCs w:val="20"/>
                     </w:rPr>
-                    <w:t>{/isAus}</w:t>
+                    <w:t>{/</w:t>
+                  </w:r>
+                  <w:proofErr w:type="spellStart"/>
+                  <w:proofErr w:type="gramStart"/>
+                  <w:r>
+                    <w:rPr>
+                      <w:rFonts w:cstheme="minorHAnsi"/>
+                      <w:b/>
+                      <w:bCs/>
+                      <w:sz w:val="20"/>
+                      <w:szCs w:val="20"/>
+                    </w:rPr>
+                    <w:t>isAus</w:t>
+                  </w:r>
+                  <w:proofErr w:type="spellEnd"/>
+                  <w:r>
+                    <w:rPr>
+                      <w:rFonts w:cstheme="minorHAnsi"/>
+                      <w:b/>
+                      <w:bCs/>
+                      <w:sz w:val="20"/>
+                      <w:szCs w:val="20"/>
+                    </w:rPr>
+                    <w:t>}{</w:t>
+                  </w:r>
+                  <w:proofErr w:type="gramEnd"/>
+                  <w:r>
+                    <w:rPr>
+                      <w:rFonts w:cstheme="minorHAnsi"/>
+                      <w:b/>
+                      <w:bCs/>
+                      <w:sz w:val="20"/>
+                      <w:szCs w:val="20"/>
+                    </w:rPr>
+                    <w:t>#</w:t>
+                  </w:r>
+                  <w:proofErr w:type="gramStart"/>
+                  <w:r>
+                    <w:rPr>
+                      <w:rFonts w:cstheme="minorHAnsi"/>
+                      <w:b/>
+                      <w:bCs/>
+                      <w:sz w:val="20"/>
+                      <w:szCs w:val="20"/>
+                    </w:rPr>
+                    <w:t>isGen}</w:t>
+                  </w:r>
+                  <w:r>
+                    <w:rPr>
+                      <w:rFonts w:cstheme="minorHAnsi"/>
+                      <w:b/>
+                      <w:spacing w:val="-4"/>
+                      <w:sz w:val="20"/>
+                      <w:szCs w:val="20"/>
+                    </w:rPr>
+                    <w:t>Brand</w:t>
+                  </w:r>
+                  <w:proofErr w:type="gramEnd"/>
+                  <w:r>
+                    <w:rPr>
+                      <w:rFonts w:cstheme="minorHAnsi"/>
+                      <w:b/>
+                      <w:bCs/>
+                      <w:sz w:val="20"/>
+                      <w:szCs w:val="20"/>
+                    </w:rPr>
+                    <w:t>{/isGen}</w:t>
                   </w:r>
                 </w:p>
               </w:tc>
               <w:tc>
                 <w:tcPr>
-                  <w:tcW w:w="1005" w:type="dxa"/>
+                  <w:tcW w:w="1701" w:type="dxa"/>
                   <w:tcBorders>
                     <w:left w:val="nil"/>
                     <w:right w:val="nil"/>
@@ -1835,7 +1979,7 @@
               </w:tc>
               <w:tc>
                 <w:tcPr>
-                  <w:tcW w:w="872" w:type="dxa"/>
+                  <w:tcW w:w="1614" w:type="dxa"/>
                   <w:tcBorders>
                     <w:left w:val="nil"/>
                   </w:tcBorders>
@@ -1867,7 +2011,7 @@
               </w:tc>
               <w:tc>
                 <w:tcPr>
-                  <w:tcW w:w="1005" w:type="dxa"/>
+                  <w:tcW w:w="911" w:type="dxa"/>
                 </w:tcPr>
                 <w:p>
                   <w:pPr>
@@ -1879,8 +2023,8 @@
                       <w:rFonts w:cstheme="minorHAnsi"/>
                       <w:b/>
                       <w:bCs/>
-                      <w:sz w:val="20"/>
-                      <w:szCs w:val="20"/>
+                      <w:sz w:val="19"/>
+                      <w:szCs w:val="19"/>
                     </w:rPr>
                   </w:pPr>
                   <w:r>
@@ -1888,8 +2032,8 @@
                       <w:rFonts w:cstheme="minorHAnsi"/>
                       <w:b/>
                       <w:bCs/>
-                      <w:sz w:val="20"/>
-                      <w:szCs w:val="20"/>
+                      <w:sz w:val="18"/>
+                      <w:szCs w:val="18"/>
                     </w:rPr>
                     <w:t>Quantity</w:t>
                   </w:r>
@@ -1897,7 +2041,7 @@
               </w:tc>
               <w:tc>
                 <w:tcPr>
-                  <w:tcW w:w="1005" w:type="dxa"/>
+                  <w:tcW w:w="855" w:type="dxa"/>
                 </w:tcPr>
                 <w:p>
                   <w:pPr>
@@ -1909,8 +2053,8 @@
                       <w:rFonts w:cstheme="minorHAnsi"/>
                       <w:b/>
                       <w:bCs/>
-                      <w:sz w:val="20"/>
-                      <w:szCs w:val="20"/>
+                      <w:sz w:val="19"/>
+                      <w:szCs w:val="19"/>
                     </w:rPr>
                   </w:pPr>
                   <w:r>
@@ -1918,8 +2062,8 @@
                       <w:rFonts w:cstheme="minorHAnsi"/>
                       <w:b/>
                       <w:bCs/>
-                      <w:sz w:val="20"/>
-                      <w:szCs w:val="20"/>
+                      <w:sz w:val="19"/>
+                      <w:szCs w:val="19"/>
                     </w:rPr>
                     <w:t>Price</w:t>
                   </w:r>
@@ -1934,8 +2078,8 @@
                       <w:rFonts w:cstheme="minorHAnsi"/>
                       <w:b/>
                       <w:bCs/>
-                      <w:sz w:val="20"/>
-                      <w:szCs w:val="20"/>
+                      <w:sz w:val="19"/>
+                      <w:szCs w:val="19"/>
                     </w:rPr>
                   </w:pPr>
                   <w:r>
@@ -1943,16 +2087,38 @@
                       <w:rFonts w:cstheme="minorHAnsi"/>
                       <w:b/>
                       <w:bCs/>
-                      <w:sz w:val="20"/>
-                      <w:szCs w:val="20"/>
-                    </w:rPr>
-                    <w:t>{currencyChar}</w:t>
+                      <w:sz w:val="19"/>
+                      <w:szCs w:val="19"/>
+                    </w:rPr>
+                    <w:t>{</w:t>
+                  </w:r>
+                  <w:proofErr w:type="spellStart"/>
+                  <w:r>
+                    <w:rPr>
+                      <w:rFonts w:cstheme="minorHAnsi"/>
+                      <w:b/>
+                      <w:bCs/>
+                      <w:sz w:val="19"/>
+                      <w:szCs w:val="19"/>
+                    </w:rPr>
+                    <w:t>currencyChar</w:t>
+                  </w:r>
+                  <w:proofErr w:type="spellEnd"/>
+                  <w:r>
+                    <w:rPr>
+                      <w:rFonts w:cstheme="minorHAnsi"/>
+                      <w:b/>
+                      <w:bCs/>
+                      <w:sz w:val="19"/>
+                      <w:szCs w:val="19"/>
+                    </w:rPr>
+                    <w:t>}</w:t>
                   </w:r>
                 </w:p>
               </w:tc>
               <w:tc>
                 <w:tcPr>
-                  <w:tcW w:w="1269" w:type="dxa"/>
+                  <w:tcW w:w="994" w:type="dxa"/>
                 </w:tcPr>
                 <w:p>
                   <w:pPr>
@@ -1964,8 +2130,8 @@
                       <w:rFonts w:cstheme="minorHAnsi"/>
                       <w:b/>
                       <w:bCs/>
-                      <w:sz w:val="20"/>
-                      <w:szCs w:val="20"/>
+                      <w:sz w:val="19"/>
+                      <w:szCs w:val="19"/>
                     </w:rPr>
                   </w:pPr>
                   <w:r>
@@ -1973,8 +2139,8 @@
                       <w:rFonts w:cstheme="minorHAnsi"/>
                       <w:b/>
                       <w:bCs/>
-                      <w:sz w:val="20"/>
-                      <w:szCs w:val="20"/>
+                      <w:sz w:val="19"/>
+                      <w:szCs w:val="19"/>
                     </w:rPr>
                     <w:t>Value</w:t>
                   </w:r>
@@ -1989,8 +2155,8 @@
                       <w:rFonts w:cstheme="minorHAnsi"/>
                       <w:b/>
                       <w:bCs/>
-                      <w:sz w:val="20"/>
-                      <w:szCs w:val="20"/>
+                      <w:sz w:val="19"/>
+                      <w:szCs w:val="19"/>
                     </w:rPr>
                   </w:pPr>
                   <w:r>
@@ -1998,21 +2164,43 @@
                       <w:rFonts w:cstheme="minorHAnsi"/>
                       <w:b/>
                       <w:bCs/>
-                      <w:sz w:val="20"/>
-                      <w:szCs w:val="20"/>
-                    </w:rPr>
-                    <w:t>{currencyChar}</w:t>
+                      <w:sz w:val="19"/>
+                      <w:szCs w:val="19"/>
+                    </w:rPr>
+                    <w:t>{</w:t>
+                  </w:r>
+                  <w:proofErr w:type="spellStart"/>
+                  <w:r>
+                    <w:rPr>
+                      <w:rFonts w:cstheme="minorHAnsi"/>
+                      <w:b/>
+                      <w:bCs/>
+                      <w:sz w:val="19"/>
+                      <w:szCs w:val="19"/>
+                    </w:rPr>
+                    <w:t>currencyChar</w:t>
+                  </w:r>
+                  <w:proofErr w:type="spellEnd"/>
+                  <w:r>
+                    <w:rPr>
+                      <w:rFonts w:cstheme="minorHAnsi"/>
+                      <w:b/>
+                      <w:bCs/>
+                      <w:sz w:val="19"/>
+                      <w:szCs w:val="19"/>
+                    </w:rPr>
+                    <w:t>}</w:t>
                   </w:r>
                 </w:p>
               </w:tc>
             </w:tr>
             <w:tr>
               <w:trPr>
-                <w:trHeight w:val="64"/>
+                <w:trHeight w:val="63"/>
               </w:trPr>
               <w:tc>
                 <w:tcPr>
-                  <w:tcW w:w="7776" w:type="dxa"/>
+                  <w:tcW w:w="8277" w:type="dxa"/>
                   <w:gridSpan w:val="5"/>
                 </w:tcPr>
                 <w:p>
@@ -2032,7 +2220,34 @@
                       <w:sz w:val="18"/>
                       <w:szCs w:val="18"/>
                     </w:rPr>
-                    <w:t>{#IPItems}{#showThickness}</w:t>
+                    <w:t>{#</w:t>
+                  </w:r>
+                  <w:proofErr w:type="gramStart"/>
+                  <w:r>
+                    <w:rPr>
+                      <w:rFonts w:cstheme="minorHAnsi"/>
+                      <w:sz w:val="18"/>
+                      <w:szCs w:val="18"/>
+                    </w:rPr>
+                    <w:t>IPItems}{</w:t>
+                  </w:r>
+                  <w:proofErr w:type="gramEnd"/>
+                  <w:r>
+                    <w:rPr>
+                      <w:rFonts w:cstheme="minorHAnsi"/>
+                      <w:sz w:val="18"/>
+                      <w:szCs w:val="18"/>
+                    </w:rPr>
+                    <w:t>#</w:t>
+                  </w:r>
+                  <w:proofErr w:type="gramStart"/>
+                  <w:r>
+                    <w:rPr>
+                      <w:rFonts w:cstheme="minorHAnsi"/>
+                      <w:sz w:val="18"/>
+                      <w:szCs w:val="18"/>
+                    </w:rPr>
+                    <w:t>showThickness}</w:t>
                   </w:r>
                   <w:r>
                     <w:rPr>
@@ -2042,7 +2257,18 @@
                       <w:sz w:val="18"/>
                       <w:szCs w:val="18"/>
                     </w:rPr>
-                    <w:t>{thicknessDetail</w:t>
+                    <w:t>{</w:t>
+                  </w:r>
+                  <w:proofErr w:type="gramEnd"/>
+                  <w:r>
+                    <w:rPr>
+                      <w:rFonts w:cstheme="minorHAnsi"/>
+                      <w:b/>
+                      <w:bCs/>
+                      <w:sz w:val="18"/>
+                      <w:szCs w:val="18"/>
+                    </w:rPr>
+                    <w:t>thicknessDetail</w:t>
                   </w:r>
                   <w:r>
                     <w:rPr>
@@ -2072,13 +2298,79 @@
                       <w:sz w:val="18"/>
                       <w:szCs w:val="18"/>
                     </w:rPr>
-                    <w:t>{length} X {width} X {height} MM  {#fsc} – {fsc}{/fsc}</w:t>
+                    <w:t xml:space="preserve">{length} X {width} X {height} </w:t>
+                  </w:r>
+                  <w:proofErr w:type="gramStart"/>
+                  <w:r>
+                    <w:rPr>
+                      <w:rFonts w:cstheme="minorHAnsi"/>
+                      <w:b/>
+                      <w:bCs/>
+                      <w:sz w:val="18"/>
+                      <w:szCs w:val="18"/>
+                    </w:rPr>
+                    <w:t>MM  {</w:t>
+                  </w:r>
+                  <w:proofErr w:type="gramEnd"/>
+                  <w:r>
+                    <w:rPr>
+                      <w:rFonts w:cstheme="minorHAnsi"/>
+                      <w:b/>
+                      <w:bCs/>
+                      <w:sz w:val="18"/>
+                      <w:szCs w:val="18"/>
+                    </w:rPr>
+                    <w:t>#fsc} – {</w:t>
+                  </w:r>
+                  <w:proofErr w:type="spellStart"/>
+                  <w:r>
+                    <w:rPr>
+                      <w:rFonts w:cstheme="minorHAnsi"/>
+                      <w:b/>
+                      <w:bCs/>
+                      <w:sz w:val="18"/>
+                      <w:szCs w:val="18"/>
+                    </w:rPr>
+                    <w:t>fsc</w:t>
+                  </w:r>
+                  <w:proofErr w:type="spellEnd"/>
+                  <w:r>
+                    <w:rPr>
+                      <w:rFonts w:cstheme="minorHAnsi"/>
+                      <w:b/>
+                      <w:bCs/>
+                      <w:sz w:val="18"/>
+                      <w:szCs w:val="18"/>
+                    </w:rPr>
+                    <w:t>}{/</w:t>
+                  </w:r>
+                  <w:proofErr w:type="spellStart"/>
+                  <w:r>
+                    <w:rPr>
+                      <w:rFonts w:cstheme="minorHAnsi"/>
+                      <w:b/>
+                      <w:bCs/>
+                      <w:sz w:val="18"/>
+                      <w:szCs w:val="18"/>
+                    </w:rPr>
+                    <w:t>fsc</w:t>
+                  </w:r>
+                  <w:proofErr w:type="spellEnd"/>
+                  <w:r>
+                    <w:rPr>
+                      <w:rFonts w:cstheme="minorHAnsi"/>
+                      <w:b/>
+                      <w:bCs/>
+                      <w:sz w:val="18"/>
+                      <w:szCs w:val="18"/>
+                    </w:rPr>
+                    <w:t>}</w:t>
                   </w:r>
                 </w:p>
               </w:tc>
               <w:tc>
                 <w:tcPr>
-                  <w:tcW w:w="1005" w:type="dxa"/>
+                  <w:tcW w:w="911" w:type="dxa"/>
                 </w:tcPr>
                 <w:p>
                   <w:pPr>
@@ -2095,7 +2387,7 @@
               </w:tc>
               <w:tc>
                 <w:tcPr>
-                  <w:tcW w:w="1005" w:type="dxa"/>
+                  <w:tcW w:w="855" w:type="dxa"/>
                 </w:tcPr>
                 <w:p>
                   <w:pPr>
@@ -2112,7 +2404,7 @@
               </w:tc>
               <w:tc>
                 <w:tcPr>
-                  <w:tcW w:w="1269" w:type="dxa"/>
+                  <w:tcW w:w="994" w:type="dxa"/>
                 </w:tcPr>
                 <w:p>
                   <w:pPr>
@@ -2130,11 +2422,11 @@
             </w:tr>
             <w:tr>
               <w:trPr>
-                <w:trHeight w:val="244"/>
+                <w:trHeight w:val="245"/>
               </w:trPr>
               <w:tc>
                 <w:tcPr>
-                  <w:tcW w:w="1985" w:type="dxa"/>
+                  <w:tcW w:w="851" w:type="dxa"/>
                   <w:tcBorders>
                     <w:right w:val="nil"/>
                   </w:tcBorders>
@@ -2156,13 +2448,67 @@
                       <w:sz w:val="18"/>
                       <w:szCs w:val="18"/>
                     </w:rPr>
-                    <w:t>{#invoices}{containerFrom}{#containerTo} to {containerTo}{/containerTo}</w:t>
+                    <w:t>{#</w:t>
+                  </w:r>
+                  <w:proofErr w:type="gramStart"/>
+                  <w:r>
+                    <w:rPr>
+                      <w:rFonts w:cstheme="minorHAnsi"/>
+                      <w:sz w:val="18"/>
+                      <w:szCs w:val="18"/>
+                    </w:rPr>
+                    <w:t>invoices}{</w:t>
+                  </w:r>
+                  <w:proofErr w:type="gramEnd"/>
+                  <w:r>
+                    <w:rPr>
+                      <w:rFonts w:cstheme="minorHAnsi"/>
+                      <w:sz w:val="18"/>
+                      <w:szCs w:val="18"/>
+                    </w:rPr>
+                    <w:t>containerFrom}{#containerTo} to {</w:t>
+                  </w:r>
+                  <w:proofErr w:type="spellStart"/>
+                  <w:r>
+                    <w:rPr>
+                      <w:rFonts w:cstheme="minorHAnsi"/>
+                      <w:sz w:val="18"/>
+                      <w:szCs w:val="18"/>
+                    </w:rPr>
+                    <w:t>containerTo</w:t>
+                  </w:r>
+                  <w:proofErr w:type="spellEnd"/>
+                  <w:r>
+                    <w:rPr>
+                      <w:rFonts w:cstheme="minorHAnsi"/>
+                      <w:sz w:val="18"/>
+                      <w:szCs w:val="18"/>
+                    </w:rPr>
+                    <w:t>}{/</w:t>
+                  </w:r>
+                  <w:proofErr w:type="spellStart"/>
+                  <w:r>
+                    <w:rPr>
+                      <w:rFonts w:cstheme="minorHAnsi"/>
+                      <w:sz w:val="18"/>
+                      <w:szCs w:val="18"/>
+                    </w:rPr>
+                    <w:t>containerTo</w:t>
+                  </w:r>
+                  <w:proofErr w:type="spellEnd"/>
+                  <w:r>
+                    <w:rPr>
+                      <w:rFonts w:cstheme="minorHAnsi"/>
+                      <w:sz w:val="18"/>
+                      <w:szCs w:val="18"/>
+                    </w:rPr>
+                    <w:t>}</w:t>
                   </w:r>
                 </w:p>
               </w:tc>
               <w:tc>
                 <w:tcPr>
-                  <w:tcW w:w="2044" w:type="dxa"/>
+                  <w:tcW w:w="2126" w:type="dxa"/>
                   <w:tcBorders>
                     <w:left w:val="nil"/>
                     <w:right w:val="nil"/>
@@ -2185,13 +2531,31 @@
                       <w:sz w:val="18"/>
                       <w:szCs w:val="18"/>
                     </w:rPr>
-                    <w:t>{materialGrade}</w:t>
+                    <w:t>{</w:t>
+                  </w:r>
+                  <w:proofErr w:type="spellStart"/>
+                  <w:r>
+                    <w:rPr>
+                      <w:rFonts w:cstheme="minorHAnsi"/>
+                      <w:sz w:val="18"/>
+                      <w:szCs w:val="18"/>
+                    </w:rPr>
+                    <w:t>materialGrade</w:t>
+                  </w:r>
+                  <w:proofErr w:type="spellEnd"/>
+                  <w:r>
+                    <w:rPr>
+                      <w:rFonts w:cstheme="minorHAnsi"/>
+                      <w:sz w:val="18"/>
+                      <w:szCs w:val="18"/>
+                    </w:rPr>
+                    <w:t>}</w:t>
                   </w:r>
                 </w:p>
               </w:tc>
               <w:tc>
                 <w:tcPr>
-                  <w:tcW w:w="1870" w:type="dxa"/>
+                  <w:tcW w:w="1985" w:type="dxa"/>
                   <w:tcBorders>
                     <w:left w:val="nil"/>
                     <w:right w:val="nil"/>
@@ -2214,13 +2578,31 @@
                       <w:sz w:val="18"/>
                       <w:szCs w:val="18"/>
                     </w:rPr>
-                    <w:t>{brandName}</w:t>
+                    <w:t>{</w:t>
+                  </w:r>
+                  <w:proofErr w:type="spellStart"/>
+                  <w:r>
+                    <w:rPr>
+                      <w:rFonts w:cstheme="minorHAnsi"/>
+                      <w:sz w:val="18"/>
+                      <w:szCs w:val="18"/>
+                    </w:rPr>
+                    <w:t>brandName</w:t>
+                  </w:r>
+                  <w:proofErr w:type="spellEnd"/>
+                  <w:r>
+                    <w:rPr>
+                      <w:rFonts w:cstheme="minorHAnsi"/>
+                      <w:sz w:val="18"/>
+                      <w:szCs w:val="18"/>
+                    </w:rPr>
+                    <w:t>}</w:t>
                   </w:r>
                 </w:p>
               </w:tc>
               <w:tc>
                 <w:tcPr>
-                  <w:tcW w:w="1005" w:type="dxa"/>
+                  <w:tcW w:w="1701" w:type="dxa"/>
                   <w:tcBorders>
                     <w:left w:val="nil"/>
                     <w:right w:val="nil"/>
@@ -2243,13 +2625,31 @@
                       <w:sz w:val="18"/>
                       <w:szCs w:val="18"/>
                     </w:rPr>
-                    <w:t>{designType}</w:t>
+                    <w:t>{</w:t>
+                  </w:r>
+                  <w:proofErr w:type="spellStart"/>
+                  <w:r>
+                    <w:rPr>
+                      <w:rFonts w:cstheme="minorHAnsi"/>
+                      <w:sz w:val="18"/>
+                      <w:szCs w:val="18"/>
+                    </w:rPr>
+                    <w:t>designType</w:t>
+                  </w:r>
+                  <w:proofErr w:type="spellEnd"/>
+                  <w:r>
+                    <w:rPr>
+                      <w:rFonts w:cstheme="minorHAnsi"/>
+                      <w:sz w:val="18"/>
+                      <w:szCs w:val="18"/>
+                    </w:rPr>
+                    <w:t>}</w:t>
                   </w:r>
                 </w:p>
               </w:tc>
               <w:tc>
                 <w:tcPr>
-                  <w:tcW w:w="872" w:type="dxa"/>
+                  <w:tcW w:w="1614" w:type="dxa"/>
                   <w:tcBorders>
                     <w:left w:val="nil"/>
                   </w:tcBorders>
@@ -2271,13 +2671,31 @@
                       <w:sz w:val="18"/>
                       <w:szCs w:val="18"/>
                     </w:rPr>
-                    <w:t>{finishType}</w:t>
+                    <w:t>{</w:t>
+                  </w:r>
+                  <w:proofErr w:type="spellStart"/>
+                  <w:r>
+                    <w:rPr>
+                      <w:rFonts w:cstheme="minorHAnsi"/>
+                      <w:sz w:val="18"/>
+                      <w:szCs w:val="18"/>
+                    </w:rPr>
+                    <w:t>finishType</w:t>
+                  </w:r>
+                  <w:proofErr w:type="spellEnd"/>
+                  <w:r>
+                    <w:rPr>
+                      <w:rFonts w:cstheme="minorHAnsi"/>
+                      <w:sz w:val="18"/>
+                      <w:szCs w:val="18"/>
+                    </w:rPr>
+                    <w:t>}</w:t>
                   </w:r>
                 </w:p>
               </w:tc>
               <w:tc>
                 <w:tcPr>
-                  <w:tcW w:w="1005" w:type="dxa"/>
+                  <w:tcW w:w="911" w:type="dxa"/>
                 </w:tcPr>
                 <w:p>
                   <w:pPr>
@@ -2303,7 +2721,7 @@
               </w:tc>
               <w:tc>
                 <w:tcPr>
-                  <w:tcW w:w="1005" w:type="dxa"/>
+                  <w:tcW w:w="855" w:type="dxa"/>
                 </w:tcPr>
                 <w:p>
                   <w:pPr>
@@ -2329,7 +2747,7 @@
               </w:tc>
               <w:tc>
                 <w:tcPr>
-                  <w:tcW w:w="1269" w:type="dxa"/>
+                  <w:tcW w:w="994" w:type="dxa"/>
                 </w:tcPr>
                 <w:p>
                   <w:pPr>
@@ -2348,7 +2766,25 @@
                       <w:sz w:val="18"/>
                       <w:szCs w:val="18"/>
                     </w:rPr>
-                    <w:t>{value} {/invoices} {/IPItems}</w:t>
+                    <w:t>{value} {/invoices} {/</w:t>
+                  </w:r>
+                  <w:proofErr w:type="spellStart"/>
+                  <w:r>
+                    <w:rPr>
+                      <w:rFonts w:cstheme="minorHAnsi"/>
+                      <w:sz w:val="18"/>
+                      <w:szCs w:val="18"/>
+                    </w:rPr>
+                    <w:t>IPItems</w:t>
+                  </w:r>
+                  <w:proofErr w:type="spellEnd"/>
+                  <w:r>
+                    <w:rPr>
+                      <w:rFonts w:cstheme="minorHAnsi"/>
+                      <w:sz w:val="18"/>
+                      <w:szCs w:val="18"/>
+                    </w:rPr>
+                    <w:t>}</w:t>
                   </w:r>
                 </w:p>
               </w:tc>
@@ -2398,6 +2834,7 @@
               </w:rPr>
               <w:t>{</w:t>
             </w:r>
+            <w:proofErr w:type="spellStart"/>
             <w:r>
               <w:rPr>
                 <w:rFonts w:cstheme="minorHAnsi"/>
@@ -2406,6 +2843,7 @@
               </w:rPr>
               <w:t>totalAmount</w:t>
             </w:r>
+            <w:proofErr w:type="spellEnd"/>
             <w:r>
               <w:rPr>
                 <w:rFonts w:cstheme="minorHAnsi"/>
@@ -2523,7 +2961,25 @@
                 <w:sz w:val="20"/>
                 <w:szCs w:val="20"/>
               </w:rPr>
-              <w:t xml:space="preserve">Addition {^isUK}- Seafreight Charges - {/isUK}  </w:t>
+              <w:t xml:space="preserve">Addition - </w:t>
+            </w:r>
+            <w:proofErr w:type="spellStart"/>
+            <w:r>
+              <w:rPr>
+                <w:rFonts w:cstheme="minorHAnsi"/>
+                <w:sz w:val="20"/>
+                <w:szCs w:val="20"/>
+              </w:rPr>
+              <w:t>Seafreight</w:t>
+            </w:r>
+            <w:proofErr w:type="spellEnd"/>
+            <w:r>
+              <w:rPr>
+                <w:rFonts w:cstheme="minorHAnsi"/>
+                <w:sz w:val="20"/>
+                <w:szCs w:val="20"/>
+              </w:rPr>
+              <w:t xml:space="preserve"> Charges -  </w:t>
             </w:r>
           </w:p>
           <w:p>
@@ -2593,7 +3049,25 @@
                 <w:sz w:val="20"/>
                 <w:szCs w:val="20"/>
               </w:rPr>
-              <w:t>{totalAddition}</w:t>
+              <w:t>{</w:t>
+            </w:r>
+            <w:proofErr w:type="spellStart"/>
+            <w:r>
+              <w:rPr>
+                <w:rFonts w:cstheme="minorHAnsi"/>
+                <w:sz w:val="20"/>
+                <w:szCs w:val="20"/>
+              </w:rPr>
+              <w:t>totalAddition</w:t>
+            </w:r>
+            <w:proofErr w:type="spellEnd"/>
+            <w:r>
+              <w:rPr>
+                <w:rFonts w:cstheme="minorHAnsi"/>
+                <w:sz w:val="20"/>
+                <w:szCs w:val="20"/>
+              </w:rPr>
+              <w:t>}</w:t>
             </w:r>
           </w:p>
           <w:p>
@@ -2613,7 +3087,25 @@
                 <w:sz w:val="20"/>
                 <w:szCs w:val="20"/>
               </w:rPr>
-              <w:t>{totalDiscount}</w:t>
+              <w:t>{</w:t>
+            </w:r>
+            <w:proofErr w:type="spellStart"/>
+            <w:r>
+              <w:rPr>
+                <w:rFonts w:cstheme="minorHAnsi"/>
+                <w:sz w:val="20"/>
+                <w:szCs w:val="20"/>
+              </w:rPr>
+              <w:t>totalDiscount</w:t>
+            </w:r>
+            <w:proofErr w:type="spellEnd"/>
+            <w:r>
+              <w:rPr>
+                <w:rFonts w:cstheme="minorHAnsi"/>
+                <w:sz w:val="20"/>
+                <w:szCs w:val="20"/>
+              </w:rPr>
+              <w:t>}</w:t>
             </w:r>
           </w:p>
           <w:p>
@@ -2668,7 +3160,107 @@
                 <w:sz w:val="20"/>
                 <w:szCs w:val="20"/>
               </w:rPr>
-              <w:t>Total {deliveryTerms} {portOfDischarge} ({finalDestination})    {currencyChar} {netAmountWords}</w:t>
+              <w:t>Total {</w:t>
+            </w:r>
+            <w:proofErr w:type="spellStart"/>
+            <w:r>
+              <w:rPr>
+                <w:rFonts w:cstheme="minorHAnsi"/>
+                <w:sz w:val="20"/>
+                <w:szCs w:val="20"/>
+              </w:rPr>
+              <w:t>deliveryTerms</w:t>
+            </w:r>
+            <w:proofErr w:type="spellEnd"/>
+            <w:r>
+              <w:rPr>
+                <w:rFonts w:cstheme="minorHAnsi"/>
+                <w:sz w:val="20"/>
+                <w:szCs w:val="20"/>
+              </w:rPr>
+              <w:t>} {</w:t>
+            </w:r>
+            <w:proofErr w:type="spellStart"/>
+            <w:r>
+              <w:rPr>
+                <w:rFonts w:cstheme="minorHAnsi"/>
+                <w:sz w:val="20"/>
+                <w:szCs w:val="20"/>
+              </w:rPr>
+              <w:t>portOfDischarge</w:t>
+            </w:r>
+            <w:proofErr w:type="spellEnd"/>
+            <w:r>
+              <w:rPr>
+                <w:rFonts w:cstheme="minorHAnsi"/>
+                <w:sz w:val="20"/>
+                <w:szCs w:val="20"/>
+              </w:rPr>
+              <w:t>} ({</w:t>
+            </w:r>
+            <w:proofErr w:type="spellStart"/>
+            <w:r>
+              <w:rPr>
+                <w:rFonts w:cstheme="minorHAnsi"/>
+                <w:sz w:val="20"/>
+                <w:szCs w:val="20"/>
+              </w:rPr>
+              <w:t>finalDestination</w:t>
+            </w:r>
+            <w:proofErr w:type="spellEnd"/>
+            <w:proofErr w:type="gramStart"/>
+            <w:r>
+              <w:rPr>
+                <w:rFonts w:cstheme="minorHAnsi"/>
+                <w:sz w:val="20"/>
+                <w:szCs w:val="20"/>
+              </w:rPr>
+              <w:t xml:space="preserve">})   </w:t>
+            </w:r>
+            <w:proofErr w:type="gramEnd"/>
+            <w:r>
+              <w:rPr>
+                <w:rFonts w:cstheme="minorHAnsi"/>
+                <w:sz w:val="20"/>
+                <w:szCs w:val="20"/>
+              </w:rPr>
+              <w:t xml:space="preserve"> {</w:t>
+            </w:r>
+            <w:proofErr w:type="spellStart"/>
+            <w:r>
+              <w:rPr>
+                <w:rFonts w:cstheme="minorHAnsi"/>
+                <w:sz w:val="20"/>
+                <w:szCs w:val="20"/>
+              </w:rPr>
+              <w:t>currencyChar</w:t>
+            </w:r>
+            <w:proofErr w:type="spellEnd"/>
+            <w:r>
+              <w:rPr>
+                <w:rFonts w:cstheme="minorHAnsi"/>
+                <w:sz w:val="20"/>
+                <w:szCs w:val="20"/>
+              </w:rPr>
+              <w:t>} {</w:t>
+            </w:r>
+            <w:proofErr w:type="spellStart"/>
+            <w:r>
+              <w:rPr>
+                <w:rFonts w:cstheme="minorHAnsi"/>
+                <w:sz w:val="20"/>
+                <w:szCs w:val="20"/>
+              </w:rPr>
+              <w:t>netAmountWords</w:t>
+            </w:r>
+            <w:proofErr w:type="spellEnd"/>
+            <w:r>
+              <w:rPr>
+                <w:rFonts w:cstheme="minorHAnsi"/>
+                <w:sz w:val="20"/>
+                <w:szCs w:val="20"/>
+              </w:rPr>
+              <w:t>}</w:t>
             </w:r>
           </w:p>
         </w:tc>
@@ -2699,7 +3291,25 @@
                 <w:sz w:val="20"/>
                 <w:szCs w:val="20"/>
               </w:rPr>
-              <w:t>{netAmount}</w:t>
+              <w:t>{</w:t>
+            </w:r>
+            <w:proofErr w:type="spellStart"/>
+            <w:r>
+              <w:rPr>
+                <w:rFonts w:cstheme="minorHAnsi"/>
+                <w:sz w:val="20"/>
+                <w:szCs w:val="20"/>
+              </w:rPr>
+              <w:t>netAmount</w:t>
+            </w:r>
+            <w:proofErr w:type="spellEnd"/>
+            <w:r>
+              <w:rPr>
+                <w:rFonts w:cstheme="minorHAnsi"/>
+                <w:sz w:val="20"/>
+                <w:szCs w:val="20"/>
+              </w:rPr>
+              <w:t>}</w:t>
             </w:r>
           </w:p>
         </w:tc>
@@ -2767,25 +3377,25 @@
               <w:t>Title of goods will remain with Alfa Ica till full payment of the invoice is received by supplier.</w:t>
             </w:r>
           </w:p>
-          <w:p>
-            <w:pPr>
-              <w:pStyle w:val="NoSpacing"/>
-              <w:spacing w:line="276" w:lineRule="auto"/>
-              <w:rPr>
-                <w:rFonts w:cstheme="minorHAnsi"/>
-                <w:sz w:val="20"/>
-                <w:szCs w:val="20"/>
-              </w:rPr>
-            </w:pPr>
-          </w:p>
         </w:tc>
       </w:tr>
+      <w:bookmarkEnd w:id="0"/>
     </w:tbl>
+    <w:p>
+      <w:pPr>
+        <w:pStyle w:val="NoSpacing"/>
+        <w:spacing w:line="276" w:lineRule="auto"/>
+        <w:rPr>
+          <w:rFonts w:cstheme="minorHAnsi"/>
+        </w:rPr>
+      </w:pPr>
+    </w:p>
     <w:tbl>
       <w:tblPr>
         <w:tblStyle w:val="TableGrid"/>
+        <w:tblpPr w:leftFromText="180" w:rightFromText="180" w:vertAnchor="text" w:tblpY="1"/>
+        <w:tblOverlap w:val="never"/>
         <w:tblW w:w="0" w:type="auto"/>
-        <w:tblInd w:w="1" w:type="dxa"/>
         <w:tblBorders>
           <w:top w:val="none" w:sz="0" w:space="0" w:color="auto"/>
           <w:left w:val="none" w:sz="0" w:space="0" w:color="auto"/>
@@ -2809,7 +3419,6 @@
           <w:tcPr>
             <w:tcW w:w="2255" w:type="dxa"/>
           </w:tcPr>
-          <w:bookmarkEnd w:id="0"/>
           <w:p>
             <w:pPr>
               <w:pStyle w:val="NoSpacing"/>
@@ -2854,6 +3463,7 @@
               </w:rPr>
               <w:t>{</w:t>
             </w:r>
+            <w:proofErr w:type="spellStart"/>
             <w:r>
               <w:rPr>
                 <w:rFonts w:cstheme="minorHAnsi"/>
@@ -2862,6 +3472,7 @@
               </w:rPr>
               <w:t>totalQuantity</w:t>
             </w:r>
+            <w:proofErr w:type="spellEnd"/>
             <w:r>
               <w:rPr>
                 <w:rFonts w:cstheme="minorHAnsi"/>
@@ -2926,6 +3537,7 @@
               </w:rPr>
               <w:t>{</w:t>
             </w:r>
+            <w:proofErr w:type="spellStart"/>
             <w:r>
               <w:rPr>
                 <w:rFonts w:cstheme="minorHAnsi"/>
@@ -2934,6 +3546,7 @@
               </w:rPr>
               <w:t>totalBox</w:t>
             </w:r>
+            <w:proofErr w:type="spellEnd"/>
             <w:r>
               <w:rPr>
                 <w:rFonts w:cstheme="minorHAnsi"/>
@@ -2991,6 +3604,7 @@
                 <w:sz w:val="20"/>
                 <w:szCs w:val="20"/>
               </w:rPr>
+              <w:lastRenderedPageBreak/>
               <w:t xml:space="preserve">Total Gross Weight: </w:t>
             </w:r>
           </w:p>
@@ -3016,8 +3630,10 @@
                 <w:sz w:val="20"/>
                 <w:szCs w:val="20"/>
               </w:rPr>
+              <w:lastRenderedPageBreak/>
               <w:t>{</w:t>
             </w:r>
+            <w:proofErr w:type="spellStart"/>
             <w:r>
               <w:rPr>
                 <w:rFonts w:cstheme="minorHAnsi"/>
@@ -3026,21 +3642,14 @@
               </w:rPr>
               <w:t>totalNetWeight</w:t>
             </w:r>
-            <w:r>
-              <w:rPr>
-                <w:rFonts w:cstheme="minorHAnsi"/>
-                <w:sz w:val="20"/>
-                <w:szCs w:val="20"/>
-              </w:rPr>
-              <w:t xml:space="preserve">} </w:t>
-            </w:r>
-            <w:r>
-              <w:rPr>
-                <w:rFonts w:cstheme="minorHAnsi"/>
-                <w:sz w:val="20"/>
-                <w:szCs w:val="20"/>
-              </w:rPr>
-              <w:t xml:space="preserve">Kg </w:t>
+            <w:proofErr w:type="spellEnd"/>
+            <w:r>
+              <w:rPr>
+                <w:rFonts w:cstheme="minorHAnsi"/>
+                <w:sz w:val="20"/>
+                <w:szCs w:val="20"/>
+              </w:rPr>
+              <w:t xml:space="preserve">} Kg </w:t>
             </w:r>
           </w:p>
           <w:p>
@@ -3060,8 +3669,10 @@
                 <w:sz w:val="20"/>
                 <w:szCs w:val="20"/>
               </w:rPr>
+              <w:lastRenderedPageBreak/>
               <w:t>{</w:t>
             </w:r>
+            <w:proofErr w:type="spellStart"/>
             <w:r>
               <w:rPr>
                 <w:rFonts w:cstheme="minorHAnsi"/>
@@ -3070,21 +3681,14 @@
               </w:rPr>
               <w:t>totalGrossWeight</w:t>
             </w:r>
-            <w:r>
-              <w:rPr>
-                <w:rFonts w:cstheme="minorHAnsi"/>
-                <w:sz w:val="20"/>
-                <w:szCs w:val="20"/>
-              </w:rPr>
-              <w:t xml:space="preserve">} </w:t>
-            </w:r>
-            <w:r>
-              <w:rPr>
-                <w:rFonts w:cstheme="minorHAnsi"/>
-                <w:sz w:val="20"/>
-                <w:szCs w:val="20"/>
-              </w:rPr>
-              <w:t>Kg</w:t>
+            <w:proofErr w:type="spellEnd"/>
+            <w:r>
+              <w:rPr>
+                <w:rFonts w:cstheme="minorHAnsi"/>
+                <w:sz w:val="20"/>
+                <w:szCs w:val="20"/>
+              </w:rPr>
+              <w:t>} Kg</w:t>
             </w:r>
           </w:p>
         </w:tc>
@@ -3092,13 +3696,19 @@
     </w:tbl>
     <w:p>
       <w:pPr>
-        <w:pStyle w:val="NoSpacing"/>
-        <w:spacing w:line="276" w:lineRule="auto"/>
-        <w:rPr>
-          <w:rFonts w:cstheme="minorHAnsi"/>
-        </w:rPr>
+        <w:tabs>
+          <w:tab w:val="left" w:pos="2127"/>
+        </w:tabs>
       </w:pPr>
     </w:p>
+    <w:p/>
+    <w:p/>
+    <w:p/>
+    <w:p/>
+    <w:p/>
+    <w:p/>
+    <w:p/>
+    <w:p/>
     <w:sectPr>
       <w:headerReference w:type="default" r:id="rId8"/>
       <w:footerReference w:type="default" r:id="rId9"/>

</xml_diff>